<commit_message>
Docs: live OpenWeather architecture across all guides + refresh ReadMe.docx; live-trained anomaly model (stale test-data trend models dropped)
</commit_message>
<xml_diff>
--- a/ReadMe.docx
+++ b/ReadMe.docx
@@ -171,7 +171,24 @@
           </w:tcPr>
           <w:p>
             <w:r>
-              <w:t>Weather stations, sensor network, satellite CSVs + live readings (</w:t>
+              <w:rPr>
+                <w:b/>
+              </w:rPr>
+              <w:t>Live OpenWeatherMap API</w:t>
+            </w:r>
+            <w:r>
+              <w:t xml:space="preserve"> (12 cities: current + air quality + 5-day forecast) with CSV backfill pipeline (</w:t>
+            </w:r>
+            <w:r>
+              <w:rPr>
+                <w:rFonts w:ascii="Consolas" w:hAnsi="Consolas"/>
+                <w:color w:val="933318"/>
+                <w:sz w:val="19"/>
+              </w:rPr>
+              <w:t>src/live/</w:t>
+            </w:r>
+            <w:r>
+              <w:t xml:space="preserve">, </w:t>
             </w:r>
             <w:r>
               <w:rPr>
@@ -268,7 +285,7 @@
               <w:t>every run timed</w:t>
             </w:r>
             <w:r>
-              <w:t xml:space="preserve"> (</w:t>
+              <w:t>, default input = live export (</w:t>
             </w:r>
             <w:r>
               <w:rPr>
@@ -301,7 +318,27 @@
           </w:tcPr>
           <w:p>
             <w:r>
-              <w:t>Background stream simulator feeding the pipeline + alert engine (</w:t>
+              <w:t xml:space="preserve">Background </w:t>
+            </w:r>
+            <w:r>
+              <w:rPr>
+                <w:b/>
+              </w:rPr>
+              <w:t>live sync thread</w:t>
+            </w:r>
+            <w:r>
+              <w:t xml:space="preserve"> (OpenWeather → cleaning → HDFS partitions → alert engine) every 10 min; offline simulator kept as test fixture (</w:t>
+            </w:r>
+            <w:r>
+              <w:rPr>
+                <w:rFonts w:ascii="Consolas" w:hAnsi="Consolas"/>
+                <w:color w:val="933318"/>
+                <w:sz w:val="19"/>
+              </w:rPr>
+              <w:t>src/live/</w:t>
+            </w:r>
+            <w:r>
+              <w:t xml:space="preserve">, </w:t>
             </w:r>
             <w:r>
               <w:rPr>
@@ -376,7 +413,16 @@
           </w:tcPr>
           <w:p>
             <w:r>
-              <w:t>Humanized React dashboard: greeting shell, toasts, metric-selectable charts, friendly empty states, mobile drawer (</w:t>
+              <w:t xml:space="preserve">Humanized React dashboard over </w:t>
+            </w:r>
+            <w:r>
+              <w:rPr>
+                <w:b/>
+              </w:rPr>
+              <w:t>live API data</w:t>
+            </w:r>
+            <w:r>
+              <w:t>: city weather cards, metric-selectable charts, toasts, friendly empty states, mobile drawer (</w:t>
             </w:r>
             <w:r>
               <w:rPr>
@@ -665,19 +711,124 @@
         <w:t>pip install -r requirements.txt</w:t>
         <w:br/>
         <w:br/>
+        <w:t># Start the REST API on http://127.0.0.1:5000</w:t>
+        <w:br/>
+        <w:t>python -m src.api.app</w:t>
+      </w:r>
+    </w:p>
+    <w:p>
+      <w:r>
+        <w:t>Live weather flows automatically: ~4 seconds after boot the API pulls current</w:t>
+      </w:r>
+    </w:p>
+    <w:p>
+      <w:r>
+        <w:t>conditions + air quality + 5-day forecasts for 12 Pakistani cities from the</w:t>
+      </w:r>
+    </w:p>
+    <w:p>
+      <w:r>
+        <w:rPr>
+          <w:b/>
+        </w:rPr>
+        <w:t>OpenWeatherMap</w:t>
+      </w:r>
+      <w:r>
+        <w:t xml:space="preserve"> free tier, then refreshes every 10 minutes</w:t>
+      </w:r>
+    </w:p>
+    <w:p>
+      <w:r>
+        <w:t>(</w:t>
+      </w:r>
+      <w:r>
+        <w:rPr>
+          <w:rFonts w:ascii="Consolas" w:hAnsi="Consolas"/>
+          <w:color w:val="933318"/>
+          <w:sz w:val="19"/>
+        </w:rPr>
+        <w:t>OW_SYNC_INTERVAL_MIN</w:t>
+      </w:r>
+      <w:r>
+        <w:t xml:space="preserve">). Key lives in </w:t>
+      </w:r>
+      <w:r>
+        <w:rPr>
+          <w:rFonts w:ascii="Consolas" w:hAnsi="Consolas"/>
+          <w:color w:val="933318"/>
+          <w:sz w:val="19"/>
+        </w:rPr>
+        <w:t>src/config.py</w:t>
+      </w:r>
+      <w:r>
+        <w:t xml:space="preserve"> and can be overridden</w:t>
+      </w:r>
+    </w:p>
+    <w:p>
+      <w:r>
+        <w:t xml:space="preserve">with the </w:t>
+      </w:r>
+      <w:r>
+        <w:rPr>
+          <w:rFonts w:ascii="Consolas" w:hAnsi="Consolas"/>
+          <w:color w:val="933318"/>
+          <w:sz w:val="19"/>
+        </w:rPr>
+        <w:t>OPENWEATHER_API_KEY</w:t>
+      </w:r>
+      <w:r>
+        <w:t xml:space="preserve"> environment variable.</w:t>
+      </w:r>
+    </w:p>
+    <w:p>
+      <w:r>
+        <w:t>&lt;details&gt;</w:t>
+      </w:r>
+    </w:p>
+    <w:p>
+      <w:r>
+        <w:t>&lt;summary&gt;Optional: offline test archives (used by the test suite / MapReduce CLI)&lt;/summary&gt;</w:t>
+      </w:r>
+    </w:p>
+    <w:p>
+      <w:r>
+        <w:rPr>
+          <w:rFonts w:ascii="Consolas" w:hAnsi="Consolas"/>
+          <w:color w:val="1F2A3D"/>
+          <w:sz w:val="18"/>
+        </w:rPr>
         <w:t># Generate synthetic test data (33k+ rows across 3 datasets)</w:t>
         <w:br/>
         <w:t>python -m src.ingestion.generate_test_data</w:t>
         <w:br/>
         <w:br/>
-        <w:t># Load data into HDFS-partitioned storage</w:t>
+        <w:t># Load the test archives into HDFS-partitioned storage</w:t>
         <w:br/>
         <w:t>python -m src.ingestion.pipeline</w:t>
-        <w:br/>
-        <w:br/>
-        <w:t># Start the REST API on http://127.0.0.1:5000</w:t>
-        <w:br/>
-        <w:t>python -m src.api.app</w:t>
+      </w:r>
+    </w:p>
+    <w:p>
+      <w:r>
+        <w:t xml:space="preserve">These archives are </w:t>
+      </w:r>
+      <w:r>
+        <w:rPr>
+          <w:b/>
+        </w:rPr>
+        <w:t>never shown in the UI</w:t>
+      </w:r>
+      <w:r>
+        <w:t xml:space="preserve"> — the dashboard only serves live</w:t>
+      </w:r>
+    </w:p>
+    <w:p>
+      <w:r>
+        <w:t>OpenWeather datasets.</w:t>
+      </w:r>
+    </w:p>
+    <w:p>
+      <w:r>
+        <w:t>&lt;/details&gt;</w:t>
       </w:r>
     </w:p>
     <w:p>
@@ -850,7 +1001,7 @@
           </w:tcPr>
           <w:p>
             <w:r>
-              <w:t>Everything: users, rules, stream control</w:t>
+              <w:t>Everything: users, rules, backups, live source</w:t>
             </w:r>
           </w:p>
         </w:tc>
@@ -902,7 +1053,7 @@
           </w:tcPr>
           <w:p>
             <w:r>
-              <w:t>Analytics, dashboards, feedback</w:t>
+              <w:t>Analytics, dashboards, sync live weather, feedback</w:t>
             </w:r>
           </w:p>
         </w:tc>
@@ -1249,10 +1400,73 @@
         <w:rPr>
           <w:b/>
         </w:rPr>
-        <w:t>Climate data is synthetic</w:t>
+        <w:t>Primary climate data is LIVE</w:t>
       </w:r>
       <w:r>
-        <w:t xml:space="preserve"> — generated by </w:t>
+        <w:t xml:space="preserve"> — real observations from the OpenWeatherMap</w:t>
+      </w:r>
+    </w:p>
+    <w:p>
+      <w:r>
+        <w:t xml:space="preserve">   free tier (</w:t>
+      </w:r>
+      <w:r>
+        <w:rPr>
+          <w:rFonts w:ascii="Consolas" w:hAnsi="Consolas"/>
+          <w:color w:val="933318"/>
+          <w:sz w:val="19"/>
+        </w:rPr>
+        <w:t>/weather</w:t>
+      </w:r>
+      <w:r>
+        <w:t xml:space="preserve">, </w:t>
+      </w:r>
+      <w:r>
+        <w:rPr>
+          <w:rFonts w:ascii="Consolas" w:hAnsi="Consolas"/>
+          <w:color w:val="933318"/>
+          <w:sz w:val="19"/>
+        </w:rPr>
+        <w:t>/air_pollution</w:t>
+      </w:r>
+      <w:r>
+        <w:t xml:space="preserve">, </w:t>
+      </w:r>
+      <w:r>
+        <w:rPr>
+          <w:rFonts w:ascii="Consolas" w:hAnsi="Consolas"/>
+          <w:color w:val="933318"/>
+          <w:sz w:val="19"/>
+        </w:rPr>
+        <w:t>/forecast</w:t>
+      </w:r>
+      <w:r>
+        <w:t xml:space="preserve"> for 12 cities; 60 calls/min</w:t>
+      </w:r>
+    </w:p>
+    <w:p>
+      <w:r>
+        <w:t xml:space="preserve">   quota protected by a 30-second sync cooldown + 10-minute auto-sync). OpenWeather</w:t>
+      </w:r>
+    </w:p>
+    <w:p>
+      <w:r>
+        <w:t xml:space="preserve">   has no outdoor CO₂/sea-level sensor, so those columns are stored as *missing*</w:t>
+      </w:r>
+    </w:p>
+    <w:p>
+      <w:r>
+        <w:t xml:space="preserve">   and skipped honestly by charts, averages and correlation (demonstrating the</w:t>
+      </w:r>
+    </w:p>
+    <w:p>
+      <w:r>
+        <w:t xml:space="preserve">   required missing-data handling). The synthetic generator</w:t>
+      </w:r>
+    </w:p>
+    <w:p>
+      <w:r>
+        <w:t xml:space="preserve">   (</w:t>
       </w:r>
       <w:r>
         <w:rPr>
@@ -1263,27 +1477,26 @@
         <w:t>generate_test_data.py</w:t>
       </w:r>
       <w:r>
-        <w:t xml:space="preserve"> with</w:t>
+        <w:t xml:space="preserve"> — realistic seasonality, warming trend, ~1.5% missing</w:t>
       </w:r>
     </w:p>
     <w:p>
       <w:r>
-        <w:t xml:space="preserve">   realistic seasonality, warming trend, regional variation, ~1.5% missing</w:t>
+        <w:t xml:space="preserve">   values, injected extreme events) remains </w:t>
+      </w:r>
+      <w:r>
+        <w:rPr>
+          <w:b/>
+        </w:rPr>
+        <w:t>only as offline test data</w:t>
+      </w:r>
+      <w:r>
+        <w:t xml:space="preserve"> for the</w:t>
       </w:r>
     </w:p>
     <w:p>
       <w:r>
-        <w:t xml:space="preserve">   values and injected extreme events (heatwave 51°C, smog 480 µg/m³,</w:t>
-      </w:r>
-    </w:p>
-    <w:p>
-      <w:r>
-        <w:t xml:space="preserve">   cloudburst 320 mm, storm 118 kph, cold wave −31°C) to demonstrate</w:t>
-      </w:r>
-    </w:p>
-    <w:p>
-      <w:r>
-        <w:t xml:space="preserve">   anomaly detection and graceful missing-data handling.</w:t>
+        <w:t xml:space="preserve">   pytest suite and the MapReduce CLI; the UI never displays it.</w:t>
       </w:r>
     </w:p>
     <w:p>
@@ -1491,7 +1704,7 @@
           <w:color w:val="1F2A3D"/>
           <w:sz w:val="18"/>
         </w:rPr>
-        <w:t>python -m pytest tests/ -q      # 109 passed</w:t>
+        <w:t>python -m pytest tests/ -q      # 129 passed</w:t>
       </w:r>
     </w:p>
     <w:p>

</xml_diff>